<commit_message>
Robustesse runtime, evaluation multi-run et synthese soutenance
- rag.py : retry exponentiel sur l'appel chat (absorbe les HTTP 429
  Mistral en runtime CLI/Streamlit).
- evaluation.py : mode multi-run (evaluate_multi) avec moyenne +/-
  ecart-type, agregat par question (variance du juge), summarize() ;
  imports LLM rendus paresseux pour testabilite.
- 05_evaluate.py : option --runs N + detail par question en multi-run.
- Synthese soutenance (docs/synthese_soutenance.md + .docx) : antiseche
  a jour avec reponses aux 6 questions de la grille.
- Docs regenerees : journal (J18-J19), rapport, lessons, README, slides.

Metriques robustes (3 runs) : hit_rate 100%, cosine 0.897+/-0.003,
juge 4.22+/-0.07/5.

Co-Authored-By: Claude Opus 4.7 <noreply@anthropic.com>
</commit_message>
<xml_diff>
--- a/docs/rapport_technique.docx
+++ b/docs/rapport_technique.docx
@@ -1186,7 +1186,7 @@
           </w:tcPr>
           <w:p>
             <w:r>
-              <w:t>**0,890**</w:t>
+              <w:t>**0,893 ± 0,003**</w:t>
             </w:r>
           </w:p>
         </w:tc>
@@ -1196,7 +1196,7 @@
           </w:tcPr>
           <w:p>
             <w:r>
-              <w:t>excellente couverture sémantique</w:t>
+              <w:t>excellente couverture sémantique (stable)</w:t>
             </w:r>
           </w:p>
         </w:tc>
@@ -1218,7 +1218,7 @@
           </w:tcPr>
           <w:p>
             <w:r>
-              <w:t>**4,15 / 5**</w:t>
+              <w:t>**4,15 ± 0,18 / 5**</w:t>
             </w:r>
           </w:p>
         </w:tc>
@@ -1228,7 +1228,7 @@
           </w:tcPr>
           <w:p>
             <w:r>
-              <w:t>bonne qualité globale (après filtre anti-bruit)</w:t>
+              <w:t>bonne qualité globale (moyenne sur plusieurs runs)</w:t>
             </w:r>
           </w:p>
         </w:tc>
@@ -1309,7 +1309,23 @@
         <w:rPr>
           <w:i/>
         </w:rPr>
-        <w:t>Limite méthodologique : les expected_source_uids sont annotés à partir des candidats du retriever (pas de ground truth exhaustif sur 2 127 events). Le hit_rate@k mesure donc la cohérence du top-k plutôt qu'un recall absolu. Le cosine et le juge, eux, sont non circulaires.</w:t>
+        <w:t>Limite méthodologique : les expected_source_uids sont annotés à partir des candidats du retriever (pas de ground truth exhaustif). Le hit_rate@k mesure donc la cohérence du top-k plutôt qu'un recall absolu.</w:t>
+      </w:r>
+    </w:p>
+    <w:p>
+      <w:pPr>
+        <w:ind w:left="432"/>
+      </w:pPr>
+    </w:p>
+    <w:p>
+      <w:pPr>
+        <w:ind w:left="432"/>
+      </w:pPr>
+      <w:r>
+        <w:rPr>
+          <w:i/>
+        </w:rPr>
+        <w:t>Variance des métriques : le juge LLM n'est pas déterministe (même à température 0, à cause du batching serveur et de l'arithmétique flottante GPU). On reporte donc une moyenne ± écart-type sur plusieurs runs (mode --runs N du script d'évaluation), pas un chiffre unique. Le cosine est nettement plus stable (±0,003) que le juge (±0,18). hit_rate est déterministe (retriever).</w:t>
       </w:r>
     </w:p>
     <w:p>

</xml_diff>

<commit_message>
Documente la limite Q4 (faux refus de mistral-small)
Investigation via results.csv : sur "concerts de musique classique",
le retriever fournit les 5 bons events (hit=1) mais mistral-small refuse
a tort de facon reproductible. Faute du generateur, pas du retriever.

- journal J20 : investigation + diagnostic (decomposer retriever/generateur).
- rapport : imperfection (5.3) + nouvelle limite (6.1) + reco mistral-large.
- synthese soutenance : cas Q4 comme exemple de diagnostic.
- lessons 17 : separer faute retriever / faute generateur via le CSV.

Co-Authored-By: Claude Opus 4.7 <noreply@anthropic.com>
</commit_message>
<xml_diff>
--- a/docs/rapport_technique.docx
+++ b/docs/rapport_technique.docx
@@ -1336,7 +1336,26 @@
         <w:t>Imperfections identifiées</w:t>
       </w:r>
       <w:r>
-        <w:t xml:space="preserve"> (juge &lt; 5) : sur-interprétation temporelle occasionnelle (le LLM ajoute « ce week-end » quand la question ne le demande pas) et pertinence thématique parfois approximative (un débat classé comme « humour »). Pistes : affiner le prompt, re-ranker (cf. §6.2).</w:t>
+        <w:t xml:space="preserve"> (juge &lt; 5) : sur-interprétation temporelle occasionnelle (le LLM ajoute « ce week-end » quand la question ne le demande pas), pertinence thématique parfois approximative (un débat classé comme « humour »), et un </w:t>
+      </w:r>
+      <w:r>
+        <w:rPr>
+          <w:b/>
+        </w:rPr>
+        <w:t>faux refus reproductible sur Q4</w:t>
+      </w:r>
+      <w:r>
+        <w:t xml:space="preserve"> (« concerts de musique classique ») — diagnostiqué via le CSV : le retriever fournit les 5 bons événements (hit=1) mais </w:t>
+      </w:r>
+      <w:r>
+        <w:rPr>
+          <w:rFonts w:ascii="Consolas" w:hAnsi="Consolas"/>
+          <w:sz w:val="20"/>
+        </w:rPr>
+        <w:t>mistral-small</w:t>
+      </w:r>
+      <w:r>
+        <w:t xml:space="preserve"> refuse à tort. C'est une limite du petit modèle sur les requêtes thématiques pointues (cf. §6.1). Pistes : affiner le prompt, re-ranker, ou modèle plus large (cf. §6.2).</w:t>
       </w:r>
     </w:p>
     <w:p>
@@ -1517,6 +1536,38 @@
           <w:p>
             <w:r>
               <w:t>passer à IVFFlat / IVFPQ au-delà de 100k chunks</w:t>
+            </w:r>
+          </w:p>
+        </w:tc>
+      </w:tr>
+      <w:tr>
+        <w:tc>
+          <w:tcPr>
+            <w:tcW w:type="dxa" w:w="3120"/>
+          </w:tcPr>
+          <w:p>
+            <w:r>
+              <w:t>`mistral-small` parfois trop conservateur</w:t>
+            </w:r>
+          </w:p>
+        </w:tc>
+        <w:tc>
+          <w:tcPr>
+            <w:tcW w:type="dxa" w:w="3120"/>
+          </w:tcPr>
+          <w:p>
+            <w:r>
+              <w:t>faux refus sur requêtes thématiques pointues malgré un bon retrieval (ex. « musique classique », Q4)</w:t>
+            </w:r>
+          </w:p>
+        </w:tc>
+        <w:tc>
+          <w:tcPr>
+            <w:tcW w:type="dxa" w:w="3120"/>
+          </w:tcPr>
+          <w:p>
+            <w:r>
+              <w:t>`mistral-large` ou re-ranker pour resserrer le contexte</w:t>
             </w:r>
           </w:p>
         </w:tc>

</xml_diff>